<commit_message>
Notes courtes : « part des remplacements difficiles » et nom du périmètre par PERIMETRE
- Note sur l'exposition : l'indicateur est nommé « part des remplacements difficiles »
  (sur 100 salariés à remplacer dans les métiers stratégiques, combien partent de
  métiers où l'on peine déjà à recruter en France) ; le mot « exposition » disparaît
  du texte lu.
- Les deux générateurs lisent la variable d'environnement PERIMETRE (défaut « Base »)
  pour nommer le périmètre dans le texte (« Base Tous salariés » jamais touché) ; README.

Co-Authored-By: Claude Fable 5.1 <noreply@anthropic.com>
Claude-Session: https://claude.ai/code/session_01UpdBM8LNqaxjQDVfn5Cm1N
</commit_message>
<xml_diff>
--- a/docs/note_courte_exposition_tension.docx
+++ b/docs/note_courte_exposition_tension.docx
@@ -43,7 +43,7 @@
           <w:sz w:val="22"/>
           <w:szCs w:val="22"/>
         </w:rPr>
-        <w:t xml:space="preserve">Ce que mesure l’estimation des départs, ce qu’ajoute l’exposition au recrutement difficile, et comment lire les résultats.</w:t>
+        <w:t xml:space="preserve">Ce que mesure l’estimation des départs, ce qu’ajoute la part des remplacements difficiles, et comment lire les résultats.</w:t>
       </w:r>
     </w:p>
     <w:p>
@@ -298,7 +298,7 @@
           <w:sz w:val="21"/>
           <w:szCs w:val="21"/>
         </w:rPr>
-        <w:t xml:space="preserve">exposition</w:t>
+        <w:t xml:space="preserve">part des remplacements difficiles</w:t>
       </w:r>
       <w:r>
         <w:rPr>
@@ -426,16 +426,16 @@
           <w:sz w:val="21"/>
           <w:szCs w:val="21"/>
         </w:rPr>
-        <w:t xml:space="preserve">L’exposition d’un département.</w:t>
-      </w:r>
-      <w:r>
-        <w:rPr>
-          <w:rFonts w:ascii="Calibri" w:cs="Calibri" w:eastAsia="Calibri" w:hAnsi="Calibri"/>
-          <w:color w:val="1F2933"/>
-          <w:sz w:val="21"/>
-          <w:szCs w:val="21"/>
-        </w:rPr>
-        <w:t xml:space="preserve"> Sur 100 départs attendus d’ici 2030 dans les métiers stratégiques du département, combien concernent des métiers en tension ? C’est l’exposition. Elle porte sur les seuls départs définitifs décrits plus haut : un métier pénible et en tension peut donc être sous-estimé, sur ses départs comme sur son exposition. Elle est comparée à la même part calculée pour la France entière, et classée faible, modérée ou forte.</w:t>
+        <w:t xml:space="preserve">La part des remplacements difficiles d’un département.</w:t>
+      </w:r>
+      <w:r>
+        <w:rPr>
+          <w:rFonts w:ascii="Calibri" w:cs="Calibri" w:eastAsia="Calibri" w:hAnsi="Calibri"/>
+          <w:color w:val="1F2933"/>
+          <w:sz w:val="21"/>
+          <w:szCs w:val="21"/>
+        </w:rPr>
+        <w:t xml:space="preserve"> Sur 100 salariés à remplacer d’ici 2030 dans les métiers stratégiques du département, combien partent de métiers où l’on peine déjà à recruter en France ? C’est la part des remplacements difficiles. Elle porte sur les seuls départs définitifs décrits plus haut : un métier pénible et en tension peut donc être sous-estimé, sur ses départs comme sur cette part. Elle est comparée à la même part calculée pour la France entière, et classée faible, modérée ou forte.</w:t>
       </w:r>
     </w:p>
     <w:p>
@@ -449,7 +449,7 @@
           <w:sz w:val="21"/>
           <w:szCs w:val="21"/>
         </w:rPr>
-        <w:t xml:space="preserve">Deux précautions. L’exposition n’est pas interprétée quand les métiers stratégiques pèsent trop peu dans les départs du département, car elle reposerait sur trop peu de cas. Elle est marquée « à confirmer » lorsqu’un petit changement d’hypothèse la ferait changer de classe ; sinon elle est « robuste ».</w:t>
+        <w:t xml:space="preserve">Deux précautions. La part n’est pas interprétée quand les métiers stratégiques pèsent trop peu dans les départs du département, car elle reposerait sur trop peu de cas. Elle est marquée « à confirmer » lorsqu’un petit changement d’hypothèse la ferait changer de classe ; sinon elle est « robuste ».</w:t>
       </w:r>
     </w:p>
     <w:p>
@@ -1071,7 +1071,7 @@
           <w:sz w:val="21"/>
           <w:szCs w:val="21"/>
         </w:rPr>
-        <w:t xml:space="preserve"> dit combien de salariés partent et à quel rythme. Les départements hachurés sont ceux dont l’exposition est forte.</w:t>
+        <w:t xml:space="preserve"> dit combien de salariés partent et à quel rythme. Les départements hachurés sont ceux dont la part des remplacements difficiles est forte.</w:t>
       </w:r>
     </w:p>
     <w:p>
@@ -1217,7 +1217,7 @@
           <w:sz w:val="21"/>
           <w:szCs w:val="21"/>
         </w:rPr>
-        <w:t xml:space="preserve">. Un département « exposé » n’est pas un département qui manque de candidats ; c’est un département dont les départs tombent sur des métiers tendus partout.</w:t>
+        <w:t xml:space="preserve">. Un département à forte part de remplacements difficiles n’est pas un département qui manque de candidats ; c’est un département dont les départs tombent sur des métiers tendus partout.</w:t>
       </w:r>
     </w:p>
     <w:p>
@@ -1291,7 +1291,7 @@
           <w:sz w:val="21"/>
           <w:szCs w:val="21"/>
         </w:rPr>
-        <w:t xml:space="preserve">Dans un département imaginaire, 300 départs sont attendus d’ici 2030 dans les métiers stratégiques, dont 210 dans des métiers en tension : exposition 70 %, contre 55 % en France, classe forte.</w:t>
+        <w:t xml:space="preserve">Dans un département imaginaire, 300 départs sont attendus d’ici 2030 dans les métiers stratégiques, dont 210 dans des métiers en tension : part des remplacements difficiles 70 %, contre 55 % en France, classe forte.</w:t>
       </w:r>
     </w:p>
     <w:p>

</xml_diff>